<commit_message>
all pages are now polished!!
</commit_message>
<xml_diff>
--- a/TaleOn.docx
+++ b/TaleOn.docx
@@ -10,7 +10,6 @@
           <w:bCs/>
         </w:rPr>
       </w:pPr>
-      <w:proofErr w:type="spellStart"/>
       <w:r>
         <w:rPr>
           <w:rFonts w:ascii="Segoe UI Emoji" w:hAnsi="Segoe UI Emoji" w:cs="Segoe UI Emoji"/>
@@ -19,7 +18,6 @@
         </w:rPr>
         <w:t>TaleOn</w:t>
       </w:r>
-      <w:proofErr w:type="spellEnd"/>
     </w:p>
     <w:p>
       <w:pPr>
@@ -632,25 +630,7 @@
           <w:b/>
           <w:bCs/>
         </w:rPr>
-        <w:t xml:space="preserve">If </w:t>
-      </w:r>
-      <w:proofErr w:type="gramStart"/>
-      <w:r>
-        <w:rPr>
-          <w:rFonts w:ascii="Segoe UI Emoji" w:hAnsi="Segoe UI Emoji" w:cs="Segoe UI Emoji"/>
-          <w:b/>
-          <w:bCs/>
-        </w:rPr>
-        <w:t>Lose</w:t>
-      </w:r>
-      <w:proofErr w:type="gramEnd"/>
-      <w:r>
-        <w:rPr>
-          <w:rFonts w:ascii="Segoe UI Emoji" w:hAnsi="Segoe UI Emoji" w:cs="Segoe UI Emoji"/>
-          <w:b/>
-          <w:bCs/>
-        </w:rPr>
-        <w:t xml:space="preserve"> → AI </w:t>
+        <w:t xml:space="preserve">If Lose → AI </w:t>
       </w:r>
       <w:r>
         <w:rPr>
@@ -827,25 +807,7 @@
           <w:b/>
           <w:bCs/>
         </w:rPr>
-        <w:t>Modern, playful fonts (</w:t>
-      </w:r>
-      <w:proofErr w:type="spellStart"/>
-      <w:r>
-        <w:rPr>
-          <w:rFonts w:ascii="Segoe UI Emoji" w:hAnsi="Segoe UI Emoji" w:cs="Segoe UI Emoji"/>
-          <w:b/>
-          <w:bCs/>
-        </w:rPr>
-        <w:t>Orbitron</w:t>
-      </w:r>
-      <w:proofErr w:type="spellEnd"/>
-      <w:r>
-        <w:rPr>
-          <w:rFonts w:ascii="Segoe UI Emoji" w:hAnsi="Segoe UI Emoji" w:cs="Segoe UI Emoji"/>
-          <w:b/>
-          <w:bCs/>
-        </w:rPr>
-        <w:t xml:space="preserve"> / Inter)</w:t>
+        <w:t>Modern, playful fonts (Orbitron / Inter)</w:t>
       </w:r>
     </w:p>
     <w:p>
@@ -951,23 +913,7 @@
           <w:b/>
           <w:bCs/>
         </w:rPr>
-        <w:t xml:space="preserve"> </w:t>
-      </w:r>
-      <w:proofErr w:type="spellStart"/>
-      <w:r>
-        <w:rPr>
-          <w:b/>
-          <w:bCs/>
-        </w:rPr>
-        <w:t>TaleOn</w:t>
-      </w:r>
-      <w:proofErr w:type="spellEnd"/>
-      <w:r>
-        <w:rPr>
-          <w:b/>
-          <w:bCs/>
-        </w:rPr>
-        <w:t xml:space="preserve"> – Pages &amp; Functionalities</w:t>
+        <w:t xml:space="preserve"> TaleOn – Pages &amp; Functionalities</w:t>
       </w:r>
     </w:p>
     <w:p>
@@ -1920,31 +1866,9 @@
     <w:p/>
     <w:p>
       <w:r>
-        <w:t>Page connection, (some pages are not able to connect, some needs buttons</w:t>
-      </w:r>
-      <w:r>
-        <w:t>),</w:t>
-      </w:r>
-      <w:r>
-        <w:t xml:space="preserve"> al</w:t>
-      </w:r>
-      <w:r>
-        <w:t>s</w:t>
-      </w:r>
-      <w:r>
-        <w:t>o, need to set how the game ends and directs to ne</w:t>
-      </w:r>
-      <w:r>
-        <w:t>x</w:t>
-      </w:r>
-      <w:r>
-        <w:t>t page!</w:t>
-      </w:r>
-      <w:r>
-        <w:t xml:space="preserve"> + error page connectivity</w:t>
-      </w:r>
-    </w:p>
-    <w:p/>
+        <w:t>Game page issue, when user refresh the page, the timer restarts will it be tackled in backed or do we need to fix it in frontend only?</w:t>
+      </w:r>
+    </w:p>
     <w:sectPr>
       <w:pgSz w:w="11906" w:h="16838"/>
       <w:pgMar w:top="1440" w:right="1440" w:bottom="1440" w:left="1440" w:header="708" w:footer="708" w:gutter="0"/>

</xml_diff>

<commit_message>
Last stage of development is ON!!
</commit_message>
<xml_diff>
--- a/TaleOn.docx
+++ b/TaleOn.docx
@@ -2627,19 +2627,11 @@
     </w:p>
     <w:p/>
     <w:p>
-      <w:r>
-        <w:t xml:space="preserve">ok now its responding but </w:t>
-      </w:r>
-      <w:proofErr w:type="gramStart"/>
-      <w:r>
-        <w:t>its</w:t>
-      </w:r>
-      <w:proofErr w:type="gramEnd"/>
-      <w:r>
-        <w:t xml:space="preserve"> giving same response every time - "The AI remains silent..."</w:t>
-      </w:r>
-    </w:p>
-    <w:p/>
+      <w:pPr>
+        <w:pStyle w:val="ListParagraph"/>
+        <w:ind w:left="2160"/>
+      </w:pPr>
+    </w:p>
     <w:sectPr>
       <w:pgSz w:w="11906" w:h="16838"/>
       <w:pgMar w:top="1440" w:right="1440" w:bottom="1440" w:left="1440" w:header="708" w:footer="708" w:gutter="0"/>
@@ -4560,7 +4552,7 @@
   <w:abstractNum w:abstractNumId="13" w15:restartNumberingAfterBreak="0">
     <w:nsid w:val="5CA27061"/>
     <w:multiLevelType w:val="multilevel"/>
-    <w:tmpl w:val="37F06212"/>
+    <w:tmpl w:val="8CB44A28"/>
     <w:lvl w:ilvl="0">
       <w:start w:val="1"/>
       <w:numFmt w:val="bullet"/>
@@ -4593,20 +4585,16 @@
         <w:sz w:val="20"/>
       </w:rPr>
     </w:lvl>
-    <w:lvl w:ilvl="2" w:tentative="1">
-      <w:start w:val="1"/>
-      <w:numFmt w:val="bullet"/>
-      <w:lvlText w:val=""/>
-      <w:lvlJc w:val="left"/>
-      <w:pPr>
-        <w:tabs>
-          <w:tab w:val="num" w:pos="2160"/>
-        </w:tabs>
+    <w:lvl w:ilvl="2">
+      <w:start w:val="1"/>
+      <w:numFmt w:val="decimal"/>
+      <w:lvlText w:val="%3"/>
+      <w:lvlJc w:val="left"/>
+      <w:pPr>
         <w:ind w:left="2160" w:hanging="360"/>
       </w:pPr>
       <w:rPr>
-        <w:rFonts w:ascii="Wingdings" w:hAnsi="Wingdings" w:hint="default"/>
-        <w:sz w:val="20"/>
+        <w:rFonts w:hint="default"/>
       </w:rPr>
     </w:lvl>
     <w:lvl w:ilvl="3" w:tentative="1">
@@ -6116,6 +6104,7 @@
   <w:style w:type="character" w:default="1" w:styleId="DefaultParagraphFont">
     <w:name w:val="Default Paragraph Font"/>
     <w:uiPriority w:val="1"/>
+    <w:semiHidden/>
     <w:unhideWhenUsed/>
   </w:style>
   <w:style w:type="table" w:default="1" w:styleId="TableNormal">

</xml_diff>